<commit_message>
Worked on multiple merge functions/UIs.
</commit_message>
<xml_diff>
--- a/project/documents/formaldocuments/MS_Assignment.docx
+++ b/project/documents/formaldocuments/MS_Assignment.docx
@@ -289,7 +289,6 @@
             <w14:uncheckedState w14:val="2610" w14:font="MS Gothic"/>
           </w14:checkbox>
         </w:sdtPr>
-        <w:sdtEndPr/>
         <w:sdtContent>
           <w:r>
             <w:rPr>
@@ -512,7 +511,6 @@
             <w:calendar w:val="gregorian"/>
           </w:date>
         </w:sdtPr>
-        <w:sdtEndPr/>
         <w:sdtContent>
           <w:r>
             <w:rPr>
@@ -572,7 +570,6 @@
           <w:id w:val="476491813"/>
           <w:text/>
         </w:sdtPr>
-        <w:sdtEndPr/>
         <w:sdtContent>
           <w:r>
             <w:rPr>
@@ -620,7 +617,6 @@
             <w:listItem w:displayText="IN - (tbd)" w:value="IN - (tbd)"/>
           </w:dropDownList>
         </w:sdtPr>
-        <w:sdtEndPr/>
         <w:sdtContent>
           <w:r>
             <w:rPr>
@@ -743,7 +739,16 @@
           <w:sz w:val="22"/>
           <w:szCs w:val="22"/>
         </w:rPr>
-        <w:t>when known</w:t>
+        <w:t xml:space="preserve">when </w:t>
+      </w:r>
+      <w:proofErr w:type="gramStart"/>
+      <w:r>
+        <w:rPr>
+          <w:rFonts w:ascii="Lucida Sans Unicode" w:hAnsi="Lucida Sans Unicode" w:cs="Lucida Sans Unicode"/>
+          <w:sz w:val="22"/>
+          <w:szCs w:val="22"/>
+        </w:rPr>
+        <w:t>known</w:t>
       </w:r>
       <w:r>
         <w:rPr>
@@ -753,6 +758,7 @@
         </w:rPr>
         <w:t>;</w:t>
       </w:r>
+      <w:proofErr w:type="gramEnd"/>
     </w:p>
     <w:p>
       <w:pPr>
@@ -790,7 +796,6 @@
             <w14:uncheckedState w14:val="2610" w14:font="MS Gothic"/>
           </w14:checkbox>
         </w:sdtPr>
-        <w:sdtEndPr/>
         <w:sdtContent>
           <w:r>
             <w:rPr>
@@ -816,57 +821,25 @@
           <w:sz w:val="22"/>
           <w:szCs w:val="22"/>
         </w:rPr>
-        <w:t xml:space="preserve">was filed on </w:t>
-      </w:r>
-      <w:sdt>
-        <w:sdtPr>
-          <w:rPr>
-            <w:rFonts w:ascii="Lucida Sans Unicode" w:hAnsi="Lucida Sans Unicode" w:cs="Lucida Sans Unicode"/>
-            <w:sz w:val="22"/>
-            <w:szCs w:val="22"/>
-            <w:u w:val="single"/>
-          </w:rPr>
-          <w:alias w:val="Filing Date"/>
-          <w:tag w:val="Filing Date"/>
-          <w:id w:val="-1751734968"/>
-          <w:date>
-            <w:dateFormat w:val="MMMM d, yyyy"/>
-            <w:lid w:val="en-US"/>
-            <w:storeMappedDataAs w:val="date"/>
-            <w:calendar w:val="gregorian"/>
-          </w:date>
-        </w:sdtPr>
-        <w:sdtEndPr/>
-        <w:sdtContent>
-          <w:r>
-            <w:rPr>
-              <w:rFonts w:ascii="Lucida Sans Unicode" w:hAnsi="Lucida Sans Unicode" w:cs="Lucida Sans Unicode"/>
-              <w:sz w:val="22"/>
-              <w:szCs w:val="22"/>
-              <w:u w:val="single"/>
-            </w:rPr>
-            <w:t>&lt;&lt;</w:t>
-          </w:r>
-          <w:r>
-            <w:rPr>
-              <w:rFonts w:ascii="Lucida Sans Unicode" w:hAnsi="Lucida Sans Unicode" w:cs="Lucida Sans Unicode"/>
-              <w:sz w:val="22"/>
-              <w:szCs w:val="22"/>
-              <w:u w:val="single"/>
-            </w:rPr>
-            <w:t>filedDate</w:t>
-          </w:r>
-          <w:r>
-            <w:rPr>
-              <w:rFonts w:ascii="Lucida Sans Unicode" w:hAnsi="Lucida Sans Unicode" w:cs="Lucida Sans Unicode"/>
-              <w:sz w:val="22"/>
-              <w:szCs w:val="22"/>
-              <w:u w:val="single"/>
-            </w:rPr>
-            <w:t>&gt;&gt;</w:t>
-          </w:r>
-        </w:sdtContent>
-      </w:sdt>
+        <w:t>was filed on</w:t>
+      </w:r>
+      <w:r>
+        <w:rPr>
+          <w:rFonts w:ascii="Lucida Sans Unicode" w:hAnsi="Lucida Sans Unicode" w:cs="Lucida Sans Unicode"/>
+          <w:sz w:val="22"/>
+          <w:szCs w:val="22"/>
+        </w:rPr>
+        <w:t xml:space="preserve"> </w:t>
+      </w:r>
+      <w:r>
+        <w:rPr>
+          <w:rFonts w:ascii="Lucida Sans Unicode" w:hAnsi="Lucida Sans Unicode" w:cs="Lucida Sans Unicode"/>
+          <w:sz w:val="22"/>
+          <w:szCs w:val="22"/>
+          <w:u w:val="single"/>
+        </w:rPr>
+        <w:t>&lt;&lt;filedDate&gt;&gt;</w:t>
+      </w:r>
       <w:r>
         <w:rPr>
           <w:rFonts w:ascii="Lucida Sans Unicode" w:hAnsi="Lucida Sans Unicode" w:cs="Lucida Sans Unicode"/>
@@ -908,50 +881,15 @@
         </w:rPr>
         <w:t xml:space="preserve"> </w:t>
       </w:r>
-      <w:sdt>
-        <w:sdtPr>
-          <w:rPr>
-            <w:rFonts w:ascii="Lucida Sans Unicode" w:hAnsi="Lucida Sans Unicode" w:cs="Lucida Sans Unicode"/>
-            <w:sz w:val="22"/>
-            <w:szCs w:val="22"/>
-            <w:u w:val="single"/>
-          </w:rPr>
-          <w:alias w:val="Application number"/>
-          <w:tag w:val="Application number"/>
-          <w:id w:val="-1435131624"/>
-          <w:text/>
-        </w:sdtPr>
-        <w:sdtEndPr/>
-        <w:sdtContent>
-          <w:r>
-            <w:rPr>
-              <w:rFonts w:ascii="Lucida Sans Unicode" w:hAnsi="Lucida Sans Unicode" w:cs="Lucida Sans Unicode"/>
-              <w:sz w:val="22"/>
-              <w:szCs w:val="22"/>
-              <w:u w:val="single"/>
-            </w:rPr>
-            <w:t>&lt;</w:t>
-          </w:r>
-          <w:r>
-            <w:rPr>
-              <w:rFonts w:ascii="Lucida Sans Unicode" w:hAnsi="Lucida Sans Unicode" w:cs="Lucida Sans Unicode"/>
-              <w:sz w:val="22"/>
-              <w:szCs w:val="22"/>
-              <w:u w:val="single"/>
-            </w:rPr>
-            <w:t>&lt;serialNo</w:t>
-          </w:r>
-          <w:r>
-            <w:rPr>
-              <w:rFonts w:ascii="Lucida Sans Unicode" w:hAnsi="Lucida Sans Unicode" w:cs="Lucida Sans Unicode"/>
-              <w:sz w:val="22"/>
-              <w:szCs w:val="22"/>
-              <w:u w:val="single"/>
-            </w:rPr>
-            <w:t>&gt;&gt;</w:t>
-          </w:r>
-        </w:sdtContent>
-      </w:sdt>
+      <w:r>
+        <w:rPr>
+          <w:rFonts w:ascii="Lucida Sans Unicode" w:hAnsi="Lucida Sans Unicode" w:cs="Lucida Sans Unicode"/>
+          <w:sz w:val="22"/>
+          <w:szCs w:val="22"/>
+          <w:u w:val="single"/>
+        </w:rPr>
+        <w:t>&lt;&lt;serialNo&gt;&gt;</w:t>
+      </w:r>
       <w:r>
         <w:rPr>
           <w:rFonts w:ascii="Lucida Sans Unicode" w:hAnsi="Lucida Sans Unicode" w:cs="Lucida Sans Unicode"/>
@@ -973,61 +911,20 @@
           <w:rFonts w:ascii="Lucida Sans Unicode" w:hAnsi="Lucida Sans Unicode" w:cs="Lucida Sans Unicode"/>
           <w:sz w:val="22"/>
           <w:szCs w:val="22"/>
+          <w:u w:val="single"/>
         </w:rPr>
         <w:t>“</w:t>
       </w:r>
-      <w:sdt>
-        <w:sdtPr>
-          <w:rPr>
-            <w:rFonts w:ascii="Lucida Sans Unicode" w:hAnsi="Lucida Sans Unicode" w:cs="Lucida Sans Unicode"/>
-            <w:sz w:val="22"/>
-            <w:szCs w:val="22"/>
-            <w:u w:val="single"/>
-          </w:rPr>
-          <w:alias w:val="Filing Office (e.g., US)"/>
-          <w:id w:val="1503699061"/>
-          <w:text/>
-        </w:sdtPr>
-        <w:sdtEndPr/>
-        <w:sdtContent>
-          <w:r>
-            <w:rPr>
-              <w:rFonts w:ascii="Lucida Sans Unicode" w:hAnsi="Lucida Sans Unicode" w:cs="Lucida Sans Unicode"/>
-              <w:sz w:val="22"/>
-              <w:szCs w:val="22"/>
-              <w:u w:val="single"/>
-            </w:rPr>
-            <w:t>&lt;&lt;country</w:t>
-          </w:r>
-          <w:r>
-            <w:rPr>
-              <w:rFonts w:ascii="Lucida Sans Unicode" w:hAnsi="Lucida Sans Unicode" w:cs="Lucida Sans Unicode"/>
-              <w:sz w:val="22"/>
-              <w:szCs w:val="22"/>
-              <w:u w:val="single"/>
-            </w:rPr>
-            <w:t>PatentOffice</w:t>
-          </w:r>
-          <w:r>
-            <w:rPr>
-              <w:rFonts w:ascii="Lucida Sans Unicode" w:hAnsi="Lucida Sans Unicode" w:cs="Lucida Sans Unicode"/>
-              <w:sz w:val="22"/>
-              <w:szCs w:val="22"/>
-              <w:u w:val="single"/>
-            </w:rPr>
-            <w:t>&gt;&gt; Patent Office</w:t>
-          </w:r>
-          <w:r>
-            <w:rPr>
-              <w:rFonts w:ascii="Lucida Sans Unicode" w:hAnsi="Lucida Sans Unicode" w:cs="Lucida Sans Unicode"/>
-              <w:sz w:val="22"/>
-              <w:szCs w:val="22"/>
-              <w:u w:val="single"/>
-            </w:rPr>
-            <w:t> </w:t>
-          </w:r>
-        </w:sdtContent>
-      </w:sdt>
+      <w:r>
+        <w:rPr>
+          <w:rFonts w:ascii="Lucida Sans Unicode" w:hAnsi="Lucida Sans Unicode" w:cs="Lucida Sans Unicode"/>
+          <w:sz w:val="22"/>
+          <w:szCs w:val="22"/>
+          <w:u w:val="single"/>
+        </w:rPr>
+        <w:t>&lt;&lt;countryPatentOffice&gt;&gt;</w:t>
+      </w:r>
+      <w:proofErr w:type="gramStart"/>
       <w:r>
         <w:rPr>
           <w:rFonts w:ascii="Lucida Sans Unicode" w:hAnsi="Lucida Sans Unicode" w:cs="Lucida Sans Unicode"/>
@@ -1044,6 +941,7 @@
         </w:rPr>
         <w:t>;</w:t>
       </w:r>
+      <w:proofErr w:type="gramEnd"/>
     </w:p>
     <w:p>
       <w:pPr>
@@ -1162,8 +1060,18 @@
           <w:sz w:val="22"/>
           <w:szCs w:val="22"/>
         </w:rPr>
-        <w:t>ASSIGNOR hereby authorizes, and requests, ASSIGNEE’S LEGAL REPRESENTATIVES to insert the Application No., filing date, and Office into the following table for any APPLICATION DERIVATIVES after they are known;</w:t>
-      </w:r>
+        <w:t xml:space="preserve">ASSIGNOR hereby authorizes, and requests, ASSIGNEE’S LEGAL REPRESENTATIVES to insert the Application No., filing date, and Office into the following table for any APPLICATION DERIVATIVES after they are </w:t>
+      </w:r>
+      <w:proofErr w:type="gramStart"/>
+      <w:r>
+        <w:rPr>
+          <w:rFonts w:ascii="Lucida Sans Unicode" w:hAnsi="Lucida Sans Unicode" w:cs="Lucida Sans Unicode"/>
+          <w:sz w:val="22"/>
+          <w:szCs w:val="22"/>
+        </w:rPr>
+        <w:t>known;</w:t>
+      </w:r>
+      <w:proofErr w:type="gramEnd"/>
     </w:p>
     <w:p>
       <w:pPr>
@@ -3809,6 +3717,21 @@
 </file>
 
 <file path=customXml/item1.xml><?xml version="1.0" encoding="utf-8"?>
+<p:properties xmlns:p="http://schemas.microsoft.com/office/2006/metadata/properties" xmlns:pc="http://schemas.microsoft.com/office/infopath/2007/PartnerControls" xmlns:xsi="http://www.w3.org/2001/XMLSchema-instance">
+  <documentManagement/>
+</p:properties>
+</file>
+
+<file path=customXml/item2.xml><?xml version="1.0" encoding="utf-8"?>
+<?mso-contentType ?>
+<FormTemplates xmlns="http://schemas.microsoft.com/sharepoint/v3/contenttype/forms">
+  <Display>DocumentLibraryForm</Display>
+  <Edit>DocumentLibraryForm</Edit>
+  <New>DocumentLibraryForm</New>
+</FormTemplates>
+</file>
+
+<file path=customXml/item3.xml><?xml version="1.0" encoding="utf-8"?>
 <ct:contentTypeSchema xmlns:ct="http://schemas.microsoft.com/office/2006/metadata/contentType" xmlns:ma="http://schemas.microsoft.com/office/2006/metadata/properties/metaAttributes" ct:_="" ma:_="" ma:contentTypeName="Document" ma:contentTypeID="0x01010081B4AC08264AF44291CAAC045189F3D9" ma:contentTypeVersion="9" ma:contentTypeDescription="Create a new document." ma:contentTypeScope="" ma:versionID="d5c8bc0f30f8d13976f962aa86ed71ce">
   <xsd:schema xmlns:xsd="http://www.w3.org/2001/XMLSchema" xmlns:xs="http://www.w3.org/2001/XMLSchema" xmlns:p="http://schemas.microsoft.com/office/2006/metadata/properties" xmlns:ns2="cb40a819-c2c9-4d15-af53-9c1dd3c293b5" xmlns:ns3="a71ab07f-1306-491e-973b-b108ad7f1f69" xmlns:ns4="9c27e8ed-b263-4d11-a06b-1d386fa22670" targetNamespace="http://schemas.microsoft.com/office/2006/metadata/properties" ma:root="true" ma:fieldsID="1bab2a59e34989f24361f6c5226c8b3f" ns2:_="" ns3:_="" ns4:_="">
     <xsd:import namespace="cb40a819-c2c9-4d15-af53-9c1dd3c293b5"/>
@@ -3992,30 +3915,32 @@
 </ct:contentTypeSchema>
 </file>
 
-<file path=customXml/item2.xml><?xml version="1.0" encoding="utf-8"?>
-<?mso-contentType ?>
-<FormTemplates xmlns="http://schemas.microsoft.com/sharepoint/v3/contenttype/forms">
-  <Display>DocumentLibraryForm</Display>
-  <Edit>DocumentLibraryForm</Edit>
-  <New>DocumentLibraryForm</New>
-</FormTemplates>
+<file path=customXml/item4.xml><?xml version="1.0" encoding="utf-8"?>
+<LongProperties xmlns="http://schemas.microsoft.com/office/2006/metadata/longProperties"/>
 </file>
 
-<file path=customXml/item3.xml><?xml version="1.0" encoding="utf-8"?>
-<p:properties xmlns:p="http://schemas.microsoft.com/office/2006/metadata/properties" xmlns:pc="http://schemas.microsoft.com/office/infopath/2007/PartnerControls" xmlns:xsi="http://www.w3.org/2001/XMLSchema-instance">
-  <documentManagement/>
-</p:properties>
-</file>
-
-<file path=customXml/item4.xml><?xml version="1.0" encoding="utf-8"?>
+<file path=customXml/item5.xml><?xml version="1.0" encoding="utf-8"?>
 <b:Sources xmlns:b="http://schemas.openxmlformats.org/officeDocument/2006/bibliography" xmlns="http://schemas.openxmlformats.org/officeDocument/2006/bibliography" SelectedStyle="\apasixtheditionofficeonline.xsl" StyleName="APA" Version="6"/>
 </file>
 
-<file path=customXml/item5.xml><?xml version="1.0" encoding="utf-8"?>
-<LongProperties xmlns="http://schemas.microsoft.com/office/2006/metadata/longProperties"/>
+<file path=customXml/itemProps1.xml><?xml version="1.0" encoding="utf-8"?>
+<ds:datastoreItem xmlns:ds="http://schemas.openxmlformats.org/officeDocument/2006/customXml" ds:itemID="{3B2936A4-5450-4C50-A66F-13D6207098A9}">
+  <ds:schemaRefs>
+    <ds:schemaRef ds:uri="http://schemas.microsoft.com/office/2006/metadata/properties"/>
+    <ds:schemaRef ds:uri="http://schemas.microsoft.com/office/infopath/2007/PartnerControls"/>
+  </ds:schemaRefs>
+</ds:datastoreItem>
 </file>
 
-<file path=customXml/itemProps1.xml><?xml version="1.0" encoding="utf-8"?>
+<file path=customXml/itemProps2.xml><?xml version="1.0" encoding="utf-8"?>
+<ds:datastoreItem xmlns:ds="http://schemas.openxmlformats.org/officeDocument/2006/customXml" ds:itemID="{F6075F92-2B4E-421C-9CF9-CC3A631EBA27}">
+  <ds:schemaRefs>
+    <ds:schemaRef ds:uri="http://schemas.microsoft.com/sharepoint/v3/contenttype/forms"/>
+  </ds:schemaRefs>
+</ds:datastoreItem>
+</file>
+
+<file path=customXml/itemProps3.xml><?xml version="1.0" encoding="utf-8"?>
 <ds:datastoreItem xmlns:ds="http://schemas.openxmlformats.org/officeDocument/2006/customXml" ds:itemID="{5A0F47DC-986B-48DA-920A-675D818EACC4}">
   <ds:schemaRefs>
     <ds:schemaRef ds:uri="http://schemas.microsoft.com/office/2006/metadata/contentType"/>
@@ -4035,44 +3960,18 @@
 </ds:datastoreItem>
 </file>
 
-<file path=customXml/itemProps2.xml><?xml version="1.0" encoding="utf-8"?>
-<ds:datastoreItem xmlns:ds="http://schemas.openxmlformats.org/officeDocument/2006/customXml" ds:itemID="{F6075F92-2B4E-421C-9CF9-CC3A631EBA27}">
+<file path=customXml/itemProps4.xml><?xml version="1.0" encoding="utf-8"?>
+<ds:datastoreItem xmlns:ds="http://schemas.openxmlformats.org/officeDocument/2006/customXml" ds:itemID="{63E19FE0-0111-4561-9E99-7B0602259AD9}">
   <ds:schemaRefs>
-    <ds:schemaRef ds:uri="http://schemas.microsoft.com/sharepoint/v3/contenttype/forms"/>
+    <ds:schemaRef ds:uri="http://schemas.microsoft.com/office/2006/metadata/longProperties"/>
   </ds:schemaRefs>
 </ds:datastoreItem>
 </file>
 
-<file path=customXml/itemProps3.xml><?xml version="1.0" encoding="utf-8"?>
-<ds:datastoreItem xmlns:ds="http://schemas.openxmlformats.org/officeDocument/2006/customXml" ds:itemID="{3B2936A4-5450-4C50-A66F-13D6207098A9}">
-  <ds:schemaRefs>
-    <ds:schemaRef ds:uri="http://schemas.openxmlformats.org/package/2006/metadata/core-properties"/>
-    <ds:schemaRef ds:uri="a71ab07f-1306-491e-973b-b108ad7f1f69"/>
-    <ds:schemaRef ds:uri="http://www.w3.org/XML/1998/namespace"/>
-    <ds:schemaRef ds:uri="http://purl.org/dc/elements/1.1/"/>
-    <ds:schemaRef ds:uri="http://schemas.microsoft.com/office/2006/metadata/properties"/>
-    <ds:schemaRef ds:uri="cb40a819-c2c9-4d15-af53-9c1dd3c293b5"/>
-    <ds:schemaRef ds:uri="http://schemas.microsoft.com/office/infopath/2007/PartnerControls"/>
-    <ds:schemaRef ds:uri="http://schemas.microsoft.com/office/2006/documentManagement/types"/>
-    <ds:schemaRef ds:uri="9c27e8ed-b263-4d11-a06b-1d386fa22670"/>
-    <ds:schemaRef ds:uri="http://purl.org/dc/dcmitype/"/>
-    <ds:schemaRef ds:uri="http://purl.org/dc/terms/"/>
-  </ds:schemaRefs>
-</ds:datastoreItem>
-</file>
-
-<file path=customXml/itemProps4.xml><?xml version="1.0" encoding="utf-8"?>
+<file path=customXml/itemProps5.xml><?xml version="1.0" encoding="utf-8"?>
 <ds:datastoreItem xmlns:ds="http://schemas.openxmlformats.org/officeDocument/2006/customXml" ds:itemID="{F523BF36-727A-4097-A186-4493B619AA0B}">
   <ds:schemaRefs>
     <ds:schemaRef ds:uri="http://schemas.openxmlformats.org/officeDocument/2006/bibliography"/>
   </ds:schemaRefs>
 </ds:datastoreItem>
-</file>
-
-<file path=customXml/itemProps5.xml><?xml version="1.0" encoding="utf-8"?>
-<ds:datastoreItem xmlns:ds="http://schemas.openxmlformats.org/officeDocument/2006/customXml" ds:itemID="{63E19FE0-0111-4561-9E99-7B0602259AD9}">
-  <ds:schemaRefs>
-    <ds:schemaRef ds:uri="http://schemas.microsoft.com/office/2006/metadata/longProperties"/>
-  </ds:schemaRefs>
-</ds:datastoreItem>
 </file>
</xml_diff>